<commit_message>
New API service project is added.
</commit_message>
<xml_diff>
--- a/POCs/ShippingLogisticsPOC/ShippingLogisticsPOC-Tasks.docx
+++ b/POCs/ShippingLogisticsPOC/ShippingLogisticsPOC-Tasks.docx
@@ -53,11 +53,15 @@
           <w:ilvl w:val="0"/>
           <w:numId w:val="1"/>
         </w:numPr>
-      </w:pPr>
-      <w:r>
-        <w:rPr>
-          <w:b/>
-          <w:bCs/>
+        <w:rPr>
+          <w:highlight w:val="yellow"/>
+        </w:rPr>
+      </w:pPr>
+      <w:r>
+        <w:rPr>
+          <w:b/>
+          <w:bCs/>
+          <w:highlight w:val="yellow"/>
         </w:rPr>
         <w:t>Feature: Database Design</w:t>
       </w:r>
@@ -68,8 +72,14 @@
           <w:ilvl w:val="1"/>
           <w:numId w:val="1"/>
         </w:numPr>
-      </w:pPr>
-      <w:r>
+        <w:rPr>
+          <w:highlight w:val="yellow"/>
+        </w:rPr>
+      </w:pPr>
+      <w:r>
+        <w:rPr>
+          <w:highlight w:val="yellow"/>
+        </w:rPr>
         <w:t>Story: Create Orders, Payments, Shipments tables with relationships.</w:t>
       </w:r>
     </w:p>
@@ -228,7 +238,7 @@
     <w:p>
       <w:r>
         <w:pict w14:anchorId="155778E6">
-          <v:rect id="_x0000_i1055" style="width:0;height:1.5pt" o:hralign="center" o:hrstd="t" o:hr="t" fillcolor="#a0a0a0" stroked="f"/>
+          <v:rect id="_x0000_i1025" style="width:0;height:1.5pt" o:hralign="center" o:hrstd="t" o:hr="t" fillcolor="#a0a0a0" stroked="f"/>
         </w:pict>
       </w:r>
     </w:p>
@@ -588,7 +598,7 @@
     <w:p>
       <w:r>
         <w:pict w14:anchorId="57C5D11E">
-          <v:rect id="_x0000_i1056" style="width:0;height:1.5pt" o:hralign="center" o:hrstd="t" o:hr="t" fillcolor="#a0a0a0" stroked="f"/>
+          <v:rect id="_x0000_i1026" style="width:0;height:1.5pt" o:hralign="center" o:hrstd="t" o:hr="t" fillcolor="#a0a0a0" stroked="f"/>
         </w:pict>
       </w:r>
     </w:p>
@@ -846,7 +856,7 @@
     <w:p>
       <w:r>
         <w:pict w14:anchorId="5AF44343">
-          <v:rect id="_x0000_i1057" style="width:0;height:1.5pt" o:hralign="center" o:hrstd="t" o:hr="t" fillcolor="#a0a0a0" stroked="f"/>
+          <v:rect id="_x0000_i1027" style="width:0;height:1.5pt" o:hralign="center" o:hrstd="t" o:hr="t" fillcolor="#a0a0a0" stroked="f"/>
         </w:pict>
       </w:r>
     </w:p>
@@ -995,7 +1005,7 @@
     <w:p>
       <w:r>
         <w:pict w14:anchorId="67C55999">
-          <v:rect id="_x0000_i1058" style="width:0;height:1.5pt" o:hralign="center" o:hrstd="t" o:hr="t" fillcolor="#a0a0a0" stroked="f"/>
+          <v:rect id="_x0000_i1028" style="width:0;height:1.5pt" o:hralign="center" o:hrstd="t" o:hr="t" fillcolor="#a0a0a0" stroked="f"/>
         </w:pict>
       </w:r>
     </w:p>
@@ -1218,7 +1228,7 @@
     <w:p>
       <w:r>
         <w:pict w14:anchorId="190B30E1">
-          <v:rect id="_x0000_i1059" style="width:0;height:1.5pt" o:hralign="center" o:hrstd="t" o:hr="t" fillcolor="#a0a0a0" stroked="f"/>
+          <v:rect id="_x0000_i1029" style="width:0;height:1.5pt" o:hralign="center" o:hrstd="t" o:hr="t" fillcolor="#a0a0a0" stroked="f"/>
         </w:pict>
       </w:r>
     </w:p>
@@ -3807,6 +3817,7 @@
   <w:style w:type="character" w:default="1" w:styleId="DefaultParagraphFont">
     <w:name w:val="Default Paragraph Font"/>
     <w:uiPriority w:val="1"/>
+    <w:semiHidden/>
     <w:unhideWhenUsed/>
   </w:style>
   <w:style w:type="table" w:default="1" w:styleId="TableNormal">

</xml_diff>